<commit_message>
Visualizer bei Ereza, Martini-Video bei Huginn
"A kishe guxu?" zeigt jetzt beides nebeneinander: das offizielle
Musikvideo und den Visualizer, der auf Instagram lief. Das Beispiel aus
der Promophase steht noch aus.

Huginns erstes Kapitel ist nicht mehr nur Text — das Konzept nach Guy
Buffets "The Perfect Martini" hat sein Video dazu.

Co-Authored-By: Claude Opus 5 <noreply@anthropic.com>
</commit_message>
<xml_diff>
--- a/Portfolio-Texte.docx
+++ b/Portfolio-Texte.docx
@@ -7494,7 +7494,7 @@
                 <w:sz w:val="21"/>
                 <w:szCs w:val="21"/>
               </w:rPr>
-              <w:t xml:space="preserve">Musikvideo, offiziell veröffentlicht. Dazu ein Visualizer für Instagram und ein Beispiel aus der Promophase.</w:t>
+              <w:t xml:space="preserve">Das Musikvideo, offiziell veröffentlicht — dazu der Visualizer, der auf Instagram lief. Ein Beispiel aus der Promophase kommt noch dazu.</w:t>
             </w:r>
           </w:p>
         </w:tc>
@@ -8026,7 +8026,7 @@
                 <w:sz w:val="21"/>
                 <w:szCs w:val="21"/>
               </w:rPr>
-              <w:t xml:space="preserve">Das erste Konzept kam von Guy Buffet und seiner Serie „The Perfect Martini": gemalte Szenen, in denen das Glas die Hauptrolle spielt. Der Plan war, darüber die Cocktails zu vermarkten.</w:t>
+              <w:t xml:space="preserve">Das erste Konzept kam von Guy Buffet und seiner Serie „The Perfect Martini": gemalte Szenen, in denen das Glas die Hauptrolle spielt. Der Plan war, darüber die Cocktails zu vermarkten — so sieht das Ergebnis aus.</w:t>
             </w:r>
           </w:p>
         </w:tc>

</xml_diff>

<commit_message>
Nostalgia: ein Bildschirm, Verpixelung nach Abstand
Der Prototyp hatte zwei Monitore nebeneinander und hat die Position im
Bild ausgewertet. Richtig ist: Es gibt einen Bildschirm, und wie grob
das Raster wird, haengt am Abstand der Person. Beide Ebenen liegen jetzt
uebereinander auf diesem einen Schirm — der RGB-Versatz bleibt, weil die
Kanaele um ein Feld verschoben sind.

Das Raster laeuft von 20 Pixeln bei weitem Abstand bis 3 Pixeln direkt
davor; es wird nur neu gesetzt, wenn die Feldgroesse wirklich springt.
Die Anzeigen heissen jetzt Abstand und Aufloesung statt Position und
Naehe, und die Aufloesung steht als Zahl da, nicht als Balken.

Mitgezogen: Beschreibung, Kapiteltexte, Aufbauskizze und die Texte in
allen drei Sprachen sprechen von einem Monitor.

Co-Authored-By: Claude Opus 5 <noreply@anthropic.com>
</commit_message>
<xml_diff>
--- a/Portfolio-Texte.docx
+++ b/Portfolio-Texte.docx
@@ -3275,7 +3275,7 @@
                 <w:sz w:val="21"/>
                 <w:szCs w:val="21"/>
               </w:rPr>
-              <w:t xml:space="preserve">Eine Videoinstallation über Nostalgie als Abwehrmechanismus: Wir verdrängen, was gerade passiert, und romantisieren es später durch den Filter von Social Media. Zwei Röhrenmonitore an den Ausgängen des Aufzugs, gesteuert nur mit Körperhaltung und Handbewegung.</w:t>
+              <w:t xml:space="preserve">Eine Videoinstallation über Nostalgie als Abwehrmechanismus: Wir verdrängen, was gerade passiert, und romantisieren es später durch den Filter von Social Media. Ein alter Röhrenmonitor am Ausgang des Aufzugs, gesteuert nur mit Körperhaltung und Handbewegung.</w:t>
             </w:r>
           </w:p>
         </w:tc>
@@ -3500,7 +3500,7 @@
                 <w:sz w:val="21"/>
                 <w:szCs w:val="21"/>
               </w:rPr>
-              <w:t xml:space="preserve">Eine Kamera liest die Körperhaltung aus, zwei TouchDesigner-Projekte rechnen daraus Schwellenwerte und streamen live auf zwei Röhrenmonitore. Die Ästhetik kommt vom Signalfehler — RGB-Versatz, Rauschen, verrissene Zeilen. Was auf einem modernen Bildschirm wie ein Defekt aussieht, ist auf der Röhre normal.</w:t>
+              <w:t xml:space="preserve">Eine Kamera liest Abstand und Haltung aus, TouchDesigner rechnet daraus Schwellenwerte und legt beide Ebenen übereinander auf einen Röhrenmonitor. Je weiter man weg steht, desto gröber das Raster — beim Herangehen löst sich das Bild auf. Die Ästhetik kommt vom Signalfehler: RGB-Versatz, Rauschen, verrissene Zeilen. Was auf einem modernen Bildschirm wie ein Defekt aussieht, ist auf der Röhre normal.</w:t>
             </w:r>
           </w:p>
         </w:tc>
@@ -3590,7 +3590,7 @@
                 <w:sz w:val="21"/>
                 <w:szCs w:val="21"/>
               </w:rPr>
-              <w:t xml:space="preserve">Wer aus dem Aufzug tritt, steht im Bild, bevor er es merkt. Es gibt nichts zu bedienen: Die Position im Raum und die Hand vor der Kamera sind die ganze Steuerung — die beiden Plakate erklären das wortlos. Oben läuft dieselbe Erkennung im Browser.</w:t>
+              <w:t xml:space="preserve">Wer aus dem Aufzug tritt, steht im Bild, bevor er es merkt. Es gibt nichts zu bedienen: Der Abstand zum Schirm und die Hand vor der Kamera sind die ganze Steuerung — die beiden Plakate erklären das wortlos. Oben läuft dieselbe Erkennung im Browser.</w:t>
             </w:r>
           </w:p>
         </w:tc>

</xml_diff>